<commit_message>
Formalize offer letter layout: center title, right-align date
Centers "Employment Offer Letter" as a proper letterhead title and
right-aligns the date line. Also replaces the web-paste-style
auto-spacing throughout the .docx with fixed, consistent spacing and
adds breathing room before each numbered section, so the generated
letter reads as a formal document rather than a copied webpage.

Co-Authored-By: Claude Sonnet 5 <noreply@anthropic.com>
</commit_message>
<xml_diff>
--- a/Employment Offer Letter tamplate.docx
+++ b/Employment Offer Letter tamplate.docx
@@ -4,34 +4,37 @@
   <w:body>
     <w:p>
       <w:pPr>
-        <w:spacing w:before="100" w:beforeAutospacing="1" w:after="100" w:afterAutospacing="1" w:line="240" w:lineRule="auto"/>
+        <w:spacing w:before="0" w:after="240" w:line="240" w:lineRule="auto"/>
         <w:outlineLvl w:val="0"/>
-        <w:rPr>
-          <w:rFonts w:ascii="Times New Roman" w:eastAsia="Times New Roman" w:hAnsi="Times New Roman" w:cs="Times New Roman"/>
-          <w:b/>
-          <w:bCs/>
-          <w:kern w:val="36"/>
-          <w:sz w:val="48"/>
-          <w:szCs w:val="48"/>
-          <w:lang w:eastAsia="en-IN"/>
-        </w:rPr>
-      </w:pPr>
-      <w:r>
-        <w:rPr>
-          <w:rFonts w:ascii="Times New Roman" w:eastAsia="Times New Roman" w:hAnsi="Times New Roman" w:cs="Times New Roman"/>
-          <w:b/>
-          <w:bCs/>
-          <w:kern w:val="36"/>
-          <w:sz w:val="48"/>
-          <w:szCs w:val="48"/>
-          <w:lang w:eastAsia="en-IN"/>
-        </w:rPr>
-        <w:t>Employment Offer Letter</w:t>
-      </w:r>
-    </w:p>
-    <w:p>
-      <w:pPr>
-        <w:spacing w:before="100" w:beforeAutospacing="1" w:after="100" w:afterAutospacing="1" w:line="240" w:lineRule="auto"/>
+        <w:jc w:val="center"/>
+        <w:rPr>
+          <w:rFonts w:ascii="Times New Roman" w:eastAsia="Times New Roman" w:hAnsi="Times New Roman" w:cs="Times New Roman"/>
+          <w:b/>
+          <w:bCs/>
+          <w:kern w:val="28"/>
+          <w:sz w:val="36"/>
+          <w:szCs w:val="36"/>
+          <w:lang w:eastAsia="en-IN"/>
+        </w:rPr>
+      </w:pPr>
+      <w:r>
+        <w:rPr>
+          <w:rFonts w:ascii="Times New Roman" w:eastAsia="Times New Roman" w:hAnsi="Times New Roman" w:cs="Times New Roman"/>
+          <w:b/>
+          <w:bCs/>
+          <w:kern w:val="28"/>
+          <w:spacing w:val="10"/>
+          <w:sz w:val="36"/>
+          <w:szCs w:val="36"/>
+          <w:lang w:eastAsia="en-IN"/>
+        </w:rPr>
+        <w:t>EMPLOYMENT OFFER LETTER</w:t>
+      </w:r>
+    </w:p>
+    <w:p>
+      <w:pPr>
+        <w:spacing w:before="0" w:after="200" w:line="240" w:lineRule="auto"/>
+        <w:jc w:val="right"/>
         <w:rPr>
           <w:rFonts w:ascii="Times New Roman" w:eastAsia="Times New Roman" w:hAnsi="Times New Roman" w:cs="Times New Roman"/>
           <w:sz w:val="24"/>
@@ -62,7 +65,7 @@
     </w:p>
     <w:p>
       <w:pPr>
-        <w:spacing w:before="100" w:beforeAutospacing="1" w:after="100" w:afterAutospacing="1" w:line="240" w:lineRule="auto"/>
+        <w:spacing w:before="0" w:after="200" w:line="276" w:lineRule="auto"/>
         <w:rPr>
           <w:rFonts w:ascii="Times New Roman" w:eastAsia="Times New Roman" w:hAnsi="Times New Roman" w:cs="Times New Roman"/>
           <w:sz w:val="24"/>
@@ -127,7 +130,7 @@
     </w:p>
     <w:p>
       <w:pPr>
-        <w:spacing w:before="100" w:beforeAutospacing="1" w:after="100" w:afterAutospacing="1" w:line="240" w:lineRule="auto"/>
+        <w:spacing w:before="0" w:after="200" w:line="276" w:lineRule="auto"/>
         <w:rPr>
           <w:rFonts w:ascii="Times New Roman" w:eastAsia="Times New Roman" w:hAnsi="Times New Roman" w:cs="Times New Roman"/>
           <w:sz w:val="24"/>
@@ -149,7 +152,7 @@
     </w:p>
     <w:p>
       <w:pPr>
-        <w:spacing w:before="100" w:beforeAutospacing="1" w:after="100" w:afterAutospacing="1" w:line="240" w:lineRule="auto"/>
+        <w:spacing w:before="0" w:after="200" w:line="276" w:lineRule="auto"/>
         <w:rPr>
           <w:rFonts w:ascii="Times New Roman" w:eastAsia="Times New Roman" w:hAnsi="Times New Roman" w:cs="Times New Roman"/>
           <w:sz w:val="24"/>
@@ -189,7 +192,7 @@
     </w:p>
     <w:p>
       <w:pPr>
-        <w:spacing w:before="100" w:beforeAutospacing="1" w:after="100" w:afterAutospacing="1" w:line="240" w:lineRule="auto"/>
+        <w:spacing w:before="0" w:after="200" w:line="276" w:lineRule="auto"/>
         <w:rPr>
           <w:rFonts w:ascii="Times New Roman" w:eastAsia="Times New Roman" w:hAnsi="Times New Roman" w:cs="Times New Roman"/>
           <w:sz w:val="24"/>
@@ -249,7 +252,7 @@
     </w:p>
     <w:p>
       <w:pPr>
-        <w:spacing w:before="100" w:beforeAutospacing="1" w:after="100" w:afterAutospacing="1" w:line="240" w:lineRule="auto"/>
+        <w:spacing w:before="0" w:after="200" w:line="276" w:lineRule="auto"/>
         <w:rPr>
           <w:rFonts w:ascii="Times New Roman" w:eastAsia="Times New Roman" w:hAnsi="Times New Roman" w:cs="Times New Roman"/>
           <w:sz w:val="24"/>
@@ -269,7 +272,7 @@
     </w:p>
     <w:p>
       <w:pPr>
-        <w:spacing w:before="100" w:beforeAutospacing="1" w:after="100" w:afterAutospacing="1" w:line="240" w:lineRule="auto"/>
+        <w:spacing w:before="360" w:after="200" w:line="276" w:lineRule="auto"/>
         <w:outlineLvl w:val="2"/>
         <w:rPr>
           <w:rFonts w:ascii="Times New Roman" w:eastAsia="Times New Roman" w:hAnsi="Times New Roman" w:cs="Times New Roman"/>
@@ -298,7 +301,7 @@
           <w:ilvl w:val="0"/>
           <w:numId w:val="1"/>
         </w:numPr>
-        <w:spacing w:before="100" w:beforeAutospacing="1" w:after="100" w:afterAutospacing="1" w:line="240" w:lineRule="auto"/>
+        <w:spacing w:before="0" w:after="200" w:line="276" w:lineRule="auto"/>
         <w:rPr>
           <w:rFonts w:ascii="Times New Roman" w:eastAsia="Times New Roman" w:hAnsi="Times New Roman" w:cs="Times New Roman"/>
           <w:sz w:val="24"/>
@@ -333,7 +336,7 @@
           <w:ilvl w:val="0"/>
           <w:numId w:val="1"/>
         </w:numPr>
-        <w:spacing w:before="100" w:beforeAutospacing="1" w:after="100" w:afterAutospacing="1" w:line="240" w:lineRule="auto"/>
+        <w:spacing w:before="0" w:after="200" w:line="276" w:lineRule="auto"/>
         <w:rPr>
           <w:rFonts w:ascii="Times New Roman" w:eastAsia="Times New Roman" w:hAnsi="Times New Roman" w:cs="Times New Roman"/>
           <w:sz w:val="24"/>
@@ -368,7 +371,7 @@
           <w:ilvl w:val="0"/>
           <w:numId w:val="1"/>
         </w:numPr>
-        <w:spacing w:before="100" w:beforeAutospacing="1" w:after="100" w:afterAutospacing="1" w:line="240" w:lineRule="auto"/>
+        <w:spacing w:before="0" w:after="200" w:line="276" w:lineRule="auto"/>
         <w:rPr>
           <w:rFonts w:ascii="Times New Roman" w:eastAsia="Times New Roman" w:hAnsi="Times New Roman" w:cs="Times New Roman"/>
           <w:sz w:val="24"/>
@@ -403,7 +406,7 @@
           <w:ilvl w:val="0"/>
           <w:numId w:val="1"/>
         </w:numPr>
-        <w:spacing w:before="100" w:beforeAutospacing="1" w:after="100" w:afterAutospacing="1" w:line="240" w:lineRule="auto"/>
+        <w:spacing w:before="0" w:after="200" w:line="276" w:lineRule="auto"/>
         <w:rPr>
           <w:rFonts w:ascii="Times New Roman" w:eastAsia="Times New Roman" w:hAnsi="Times New Roman" w:cs="Times New Roman"/>
           <w:sz w:val="24"/>
@@ -434,7 +437,7 @@
     </w:p>
     <w:p>
       <w:pPr>
-        <w:spacing w:before="100" w:beforeAutospacing="1" w:after="100" w:afterAutospacing="1" w:line="240" w:lineRule="auto"/>
+        <w:spacing w:before="360" w:after="200" w:line="276" w:lineRule="auto"/>
         <w:outlineLvl w:val="2"/>
         <w:rPr>
           <w:rFonts w:ascii="Times New Roman" w:eastAsia="Times New Roman" w:hAnsi="Times New Roman" w:cs="Times New Roman"/>
@@ -459,7 +462,7 @@
     </w:p>
     <w:p>
       <w:pPr>
-        <w:spacing w:before="100" w:beforeAutospacing="1" w:after="100" w:afterAutospacing="1" w:line="240" w:lineRule="auto"/>
+        <w:spacing w:before="0" w:after="200" w:line="276" w:lineRule="auto"/>
         <w:rPr>
           <w:rFonts w:ascii="Times New Roman" w:eastAsia="Times New Roman" w:hAnsi="Times New Roman" w:cs="Times New Roman"/>
           <w:sz w:val="24"/>
@@ -499,7 +502,7 @@
     </w:p>
     <w:p>
       <w:pPr>
-        <w:spacing w:before="100" w:beforeAutospacing="1" w:after="100" w:afterAutospacing="1" w:line="240" w:lineRule="auto"/>
+        <w:spacing w:before="360" w:after="200" w:line="276" w:lineRule="auto"/>
         <w:outlineLvl w:val="2"/>
         <w:rPr>
           <w:rFonts w:ascii="Times New Roman" w:eastAsia="Times New Roman" w:hAnsi="Times New Roman" w:cs="Times New Roman"/>
@@ -524,7 +527,7 @@
     </w:p>
     <w:p>
       <w:pPr>
-        <w:spacing w:before="100" w:beforeAutospacing="1" w:after="100" w:afterAutospacing="1" w:line="240" w:lineRule="auto"/>
+        <w:spacing w:before="0" w:after="200" w:line="276" w:lineRule="auto"/>
         <w:rPr>
           <w:rFonts w:ascii="Times New Roman" w:eastAsia="Times New Roman" w:hAnsi="Times New Roman" w:cs="Times New Roman"/>
           <w:sz w:val="24"/>
@@ -564,7 +567,7 @@
     </w:p>
     <w:p>
       <w:pPr>
-        <w:spacing w:before="100" w:beforeAutospacing="1" w:after="100" w:afterAutospacing="1" w:line="240" w:lineRule="auto"/>
+        <w:spacing w:before="360" w:after="200" w:line="276" w:lineRule="auto"/>
         <w:outlineLvl w:val="2"/>
         <w:rPr>
           <w:rFonts w:ascii="Times New Roman" w:eastAsia="Times New Roman" w:hAnsi="Times New Roman" w:cs="Times New Roman"/>
@@ -589,7 +592,7 @@
     </w:p>
     <w:p>
       <w:pPr>
-        <w:spacing w:before="100" w:beforeAutospacing="1" w:after="100" w:afterAutospacing="1" w:line="240" w:lineRule="auto"/>
+        <w:spacing w:before="0" w:after="200" w:line="276" w:lineRule="auto"/>
         <w:rPr>
           <w:rFonts w:ascii="Times New Roman" w:eastAsia="Times New Roman" w:hAnsi="Times New Roman" w:cs="Times New Roman"/>
           <w:sz w:val="24"/>
@@ -629,7 +632,7 @@
     </w:p>
     <w:p>
       <w:pPr>
-        <w:spacing w:before="100" w:beforeAutospacing="1" w:after="100" w:afterAutospacing="1" w:line="240" w:lineRule="auto"/>
+        <w:spacing w:before="360" w:after="200" w:line="276" w:lineRule="auto"/>
         <w:outlineLvl w:val="2"/>
         <w:rPr>
           <w:rFonts w:ascii="Times New Roman" w:eastAsia="Times New Roman" w:hAnsi="Times New Roman" w:cs="Times New Roman"/>
@@ -654,7 +657,7 @@
     </w:p>
     <w:p>
       <w:pPr>
-        <w:spacing w:before="100" w:beforeAutospacing="1" w:after="100" w:afterAutospacing="1" w:line="240" w:lineRule="auto"/>
+        <w:spacing w:before="0" w:after="200" w:line="276" w:lineRule="auto"/>
         <w:rPr>
           <w:rFonts w:ascii="Times New Roman" w:eastAsia="Times New Roman" w:hAnsi="Times New Roman" w:cs="Times New Roman"/>
           <w:sz w:val="24"/>
@@ -707,7 +710,7 @@
     </w:p>
     <w:p>
       <w:pPr>
-        <w:spacing w:before="100" w:beforeAutospacing="1" w:after="100" w:afterAutospacing="1" w:line="240" w:lineRule="auto"/>
+        <w:spacing w:before="360" w:after="200" w:line="276" w:lineRule="auto"/>
         <w:outlineLvl w:val="2"/>
         <w:rPr>
           <w:rFonts w:ascii="Times New Roman" w:eastAsia="Times New Roman" w:hAnsi="Times New Roman" w:cs="Times New Roman"/>
@@ -732,7 +735,7 @@
     </w:p>
     <w:p>
       <w:pPr>
-        <w:spacing w:before="100" w:beforeAutospacing="1" w:after="100" w:afterAutospacing="1" w:line="240" w:lineRule="auto"/>
+        <w:spacing w:before="0" w:after="200" w:line="276" w:lineRule="auto"/>
         <w:rPr>
           <w:rFonts w:ascii="Times New Roman" w:eastAsia="Times New Roman" w:hAnsi="Times New Roman" w:cs="Times New Roman"/>
           <w:sz w:val="24"/>
@@ -752,7 +755,7 @@
     </w:p>
     <w:p>
       <w:pPr>
-        <w:spacing w:before="100" w:beforeAutospacing="1" w:after="100" w:afterAutospacing="1" w:line="240" w:lineRule="auto"/>
+        <w:spacing w:before="360" w:after="200" w:line="276" w:lineRule="auto"/>
         <w:outlineLvl w:val="2"/>
         <w:rPr>
           <w:rFonts w:ascii="Times New Roman" w:eastAsia="Times New Roman" w:hAnsi="Times New Roman" w:cs="Times New Roman"/>
@@ -778,7 +781,7 @@
     </w:p>
     <w:p>
       <w:pPr>
-        <w:spacing w:before="100" w:beforeAutospacing="1" w:after="100" w:afterAutospacing="1" w:line="240" w:lineRule="auto"/>
+        <w:spacing w:before="0" w:after="200" w:line="276" w:lineRule="auto"/>
         <w:rPr>
           <w:rFonts w:ascii="Times New Roman" w:eastAsia="Times New Roman" w:hAnsi="Times New Roman" w:cs="Times New Roman"/>
           <w:sz w:val="24"/>
@@ -798,7 +801,7 @@
     </w:p>
     <w:p>
       <w:pPr>
-        <w:spacing w:before="100" w:beforeAutospacing="1" w:after="100" w:afterAutospacing="1" w:line="240" w:lineRule="auto"/>
+        <w:spacing w:before="360" w:after="200" w:line="276" w:lineRule="auto"/>
         <w:outlineLvl w:val="2"/>
         <w:rPr>
           <w:rFonts w:ascii="Times New Roman" w:eastAsia="Times New Roman" w:hAnsi="Times New Roman" w:cs="Times New Roman"/>
@@ -823,7 +826,7 @@
     </w:p>
     <w:p>
       <w:pPr>
-        <w:spacing w:before="100" w:beforeAutospacing="1" w:after="100" w:afterAutospacing="1" w:line="240" w:lineRule="auto"/>
+        <w:spacing w:before="0" w:after="200" w:line="276" w:lineRule="auto"/>
         <w:rPr>
           <w:rFonts w:ascii="Times New Roman" w:eastAsia="Times New Roman" w:hAnsi="Times New Roman" w:cs="Times New Roman"/>
           <w:sz w:val="24"/>
@@ -843,7 +846,7 @@
     </w:p>
     <w:p>
       <w:pPr>
-        <w:spacing w:before="100" w:beforeAutospacing="1" w:after="100" w:afterAutospacing="1" w:line="240" w:lineRule="auto"/>
+        <w:spacing w:before="360" w:after="200" w:line="276" w:lineRule="auto"/>
         <w:outlineLvl w:val="2"/>
         <w:rPr>
           <w:rFonts w:ascii="Times New Roman" w:eastAsia="Times New Roman" w:hAnsi="Times New Roman" w:cs="Times New Roman"/>
@@ -868,7 +871,7 @@
     </w:p>
     <w:p>
       <w:pPr>
-        <w:spacing w:before="100" w:beforeAutospacing="1" w:after="100" w:afterAutospacing="1" w:line="240" w:lineRule="auto"/>
+        <w:spacing w:before="0" w:after="200" w:line="276" w:lineRule="auto"/>
         <w:rPr>
           <w:rFonts w:ascii="Times New Roman" w:eastAsia="Times New Roman" w:hAnsi="Times New Roman" w:cs="Times New Roman"/>
           <w:sz w:val="24"/>
@@ -888,7 +891,7 @@
     </w:p>
     <w:p>
       <w:pPr>
-        <w:spacing w:before="100" w:beforeAutospacing="1" w:after="100" w:afterAutospacing="1" w:line="240" w:lineRule="auto"/>
+        <w:spacing w:before="360" w:after="200" w:line="276" w:lineRule="auto"/>
         <w:outlineLvl w:val="2"/>
         <w:rPr>
           <w:rFonts w:ascii="Times New Roman" w:eastAsia="Times New Roman" w:hAnsi="Times New Roman" w:cs="Times New Roman"/>
@@ -913,7 +916,7 @@
     </w:p>
     <w:p>
       <w:pPr>
-        <w:spacing w:before="100" w:beforeAutospacing="1" w:after="100" w:afterAutospacing="1" w:line="240" w:lineRule="auto"/>
+        <w:spacing w:before="0" w:after="200" w:line="276" w:lineRule="auto"/>
         <w:rPr>
           <w:rFonts w:ascii="Times New Roman" w:eastAsia="Times New Roman" w:hAnsi="Times New Roman" w:cs="Times New Roman"/>
           <w:sz w:val="24"/>
@@ -933,7 +936,7 @@
     </w:p>
     <w:p>
       <w:pPr>
-        <w:spacing w:before="100" w:beforeAutospacing="1" w:after="100" w:afterAutospacing="1" w:line="240" w:lineRule="auto"/>
+        <w:spacing w:before="360" w:after="200" w:line="276" w:lineRule="auto"/>
         <w:outlineLvl w:val="2"/>
         <w:rPr>
           <w:rFonts w:ascii="Times New Roman" w:eastAsia="Times New Roman" w:hAnsi="Times New Roman" w:cs="Times New Roman"/>
@@ -958,7 +961,7 @@
     </w:p>
     <w:p>
       <w:pPr>
-        <w:spacing w:before="100" w:beforeAutospacing="1" w:after="100" w:afterAutospacing="1" w:line="240" w:lineRule="auto"/>
+        <w:spacing w:before="0" w:after="200" w:line="276" w:lineRule="auto"/>
         <w:rPr>
           <w:rFonts w:ascii="Times New Roman" w:eastAsia="Times New Roman" w:hAnsi="Times New Roman" w:cs="Times New Roman"/>
           <w:sz w:val="24"/>
@@ -982,7 +985,7 @@
           <w:ilvl w:val="0"/>
           <w:numId w:val="2"/>
         </w:numPr>
-        <w:spacing w:before="100" w:beforeAutospacing="1" w:after="100" w:afterAutospacing="1" w:line="240" w:lineRule="auto"/>
+        <w:spacing w:before="0" w:after="200" w:line="276" w:lineRule="auto"/>
         <w:rPr>
           <w:rFonts w:ascii="Times New Roman" w:eastAsia="Times New Roman" w:hAnsi="Times New Roman" w:cs="Times New Roman"/>
           <w:sz w:val="24"/>
@@ -1033,7 +1036,7 @@
           <w:ilvl w:val="0"/>
           <w:numId w:val="2"/>
         </w:numPr>
-        <w:spacing w:before="100" w:beforeAutospacing="1" w:after="100" w:afterAutospacing="1" w:line="240" w:lineRule="auto"/>
+        <w:spacing w:before="0" w:after="200" w:line="276" w:lineRule="auto"/>
         <w:rPr>
           <w:rFonts w:ascii="Times New Roman" w:eastAsia="Times New Roman" w:hAnsi="Times New Roman" w:cs="Times New Roman"/>
           <w:sz w:val="24"/>
@@ -1057,7 +1060,7 @@
           <w:ilvl w:val="0"/>
           <w:numId w:val="2"/>
         </w:numPr>
-        <w:spacing w:before="100" w:beforeAutospacing="1" w:after="100" w:afterAutospacing="1" w:line="240" w:lineRule="auto"/>
+        <w:spacing w:before="0" w:after="200" w:line="276" w:lineRule="auto"/>
         <w:rPr>
           <w:rFonts w:ascii="Times New Roman" w:eastAsia="Times New Roman" w:hAnsi="Times New Roman" w:cs="Times New Roman"/>
           <w:sz w:val="24"/>
@@ -1081,7 +1084,7 @@
           <w:ilvl w:val="0"/>
           <w:numId w:val="2"/>
         </w:numPr>
-        <w:spacing w:before="100" w:beforeAutospacing="1" w:after="100" w:afterAutospacing="1" w:line="240" w:lineRule="auto"/>
+        <w:spacing w:before="0" w:after="200" w:line="276" w:lineRule="auto"/>
         <w:rPr>
           <w:rFonts w:ascii="Times New Roman" w:eastAsia="Times New Roman" w:hAnsi="Times New Roman" w:cs="Times New Roman"/>
           <w:sz w:val="24"/>
@@ -1123,7 +1126,7 @@
           <w:ilvl w:val="0"/>
           <w:numId w:val="2"/>
         </w:numPr>
-        <w:spacing w:before="100" w:beforeAutospacing="1" w:after="100" w:afterAutospacing="1" w:line="240" w:lineRule="auto"/>
+        <w:spacing w:before="0" w:after="200" w:line="276" w:lineRule="auto"/>
         <w:rPr>
           <w:rFonts w:ascii="Times New Roman" w:eastAsia="Times New Roman" w:hAnsi="Times New Roman" w:cs="Times New Roman"/>
           <w:sz w:val="24"/>
@@ -1166,7 +1169,7 @@
           <w:ilvl w:val="0"/>
           <w:numId w:val="2"/>
         </w:numPr>
-        <w:spacing w:before="100" w:beforeAutospacing="1" w:after="100" w:afterAutospacing="1" w:line="240" w:lineRule="auto"/>
+        <w:spacing w:before="0" w:after="200" w:line="276" w:lineRule="auto"/>
         <w:rPr>
           <w:rFonts w:ascii="Times New Roman" w:eastAsia="Times New Roman" w:hAnsi="Times New Roman" w:cs="Times New Roman"/>
           <w:sz w:val="24"/>
@@ -1190,7 +1193,7 @@
           <w:ilvl w:val="0"/>
           <w:numId w:val="2"/>
         </w:numPr>
-        <w:spacing w:before="100" w:beforeAutospacing="1" w:after="100" w:afterAutospacing="1" w:line="240" w:lineRule="auto"/>
+        <w:spacing w:before="0" w:after="200" w:line="276" w:lineRule="auto"/>
         <w:rPr>
           <w:rFonts w:ascii="Times New Roman" w:eastAsia="Times New Roman" w:hAnsi="Times New Roman" w:cs="Times New Roman"/>
           <w:sz w:val="24"/>
@@ -1232,7 +1235,7 @@
           <w:ilvl w:val="0"/>
           <w:numId w:val="2"/>
         </w:numPr>
-        <w:spacing w:before="100" w:beforeAutospacing="1" w:after="100" w:afterAutospacing="1" w:line="240" w:lineRule="auto"/>
+        <w:spacing w:before="0" w:after="200" w:line="276" w:lineRule="auto"/>
         <w:rPr>
           <w:rFonts w:ascii="Times New Roman" w:eastAsia="Times New Roman" w:hAnsi="Times New Roman" w:cs="Times New Roman"/>
           <w:sz w:val="24"/>
@@ -1256,7 +1259,7 @@
           <w:ilvl w:val="0"/>
           <w:numId w:val="2"/>
         </w:numPr>
-        <w:spacing w:before="100" w:beforeAutospacing="1" w:after="100" w:afterAutospacing="1" w:line="240" w:lineRule="auto"/>
+        <w:spacing w:before="0" w:after="200" w:line="276" w:lineRule="auto"/>
         <w:rPr>
           <w:rFonts w:ascii="Times New Roman" w:eastAsia="Times New Roman" w:hAnsi="Times New Roman" w:cs="Times New Roman"/>
           <w:sz w:val="24"/>
@@ -1276,7 +1279,7 @@
     </w:p>
     <w:p>
       <w:pPr>
-        <w:spacing w:before="100" w:beforeAutospacing="1" w:after="100" w:afterAutospacing="1" w:line="240" w:lineRule="auto"/>
+        <w:spacing w:before="360" w:after="200" w:line="276" w:lineRule="auto"/>
         <w:outlineLvl w:val="2"/>
         <w:rPr>
           <w:rFonts w:ascii="Times New Roman" w:eastAsia="Times New Roman" w:hAnsi="Times New Roman" w:cs="Times New Roman"/>
@@ -1301,7 +1304,7 @@
     </w:p>
     <w:p>
       <w:pPr>
-        <w:spacing w:before="100" w:beforeAutospacing="1" w:after="100" w:afterAutospacing="1" w:line="240" w:lineRule="auto"/>
+        <w:spacing w:before="0" w:after="200" w:line="276" w:lineRule="auto"/>
         <w:rPr>
           <w:rFonts w:ascii="Times New Roman" w:eastAsia="Times New Roman" w:hAnsi="Times New Roman" w:cs="Times New Roman"/>
           <w:sz w:val="24"/>
@@ -1341,7 +1344,7 @@
     </w:p>
     <w:p>
       <w:pPr>
-        <w:spacing w:before="100" w:beforeAutospacing="1" w:after="100" w:afterAutospacing="1" w:line="240" w:lineRule="auto"/>
+        <w:spacing w:before="360" w:after="200" w:line="276" w:lineRule="auto"/>
         <w:outlineLvl w:val="2"/>
         <w:rPr>
           <w:rFonts w:ascii="Times New Roman" w:eastAsia="Times New Roman" w:hAnsi="Times New Roman" w:cs="Times New Roman"/>
@@ -1366,7 +1369,7 @@
     </w:p>
     <w:p>
       <w:pPr>
-        <w:spacing w:before="100" w:beforeAutospacing="1" w:after="100" w:afterAutospacing="1" w:line="240" w:lineRule="auto"/>
+        <w:spacing w:before="0" w:after="200" w:line="276" w:lineRule="auto"/>
         <w:rPr>
           <w:rFonts w:ascii="Times New Roman" w:eastAsia="Times New Roman" w:hAnsi="Times New Roman" w:cs="Times New Roman"/>
           <w:sz w:val="24"/>
@@ -1406,7 +1409,7 @@
     </w:p>
     <w:p>
       <w:pPr>
-        <w:spacing w:before="100" w:beforeAutospacing="1" w:after="100" w:afterAutospacing="1" w:line="240" w:lineRule="auto"/>
+        <w:spacing w:before="0" w:after="200" w:line="276" w:lineRule="auto"/>
         <w:rPr>
           <w:rFonts w:ascii="Times New Roman" w:eastAsia="Times New Roman" w:hAnsi="Times New Roman" w:cs="Times New Roman"/>
           <w:sz w:val="24"/>
@@ -1446,7 +1449,7 @@
     </w:p>
     <w:p>
       <w:pPr>
-        <w:spacing w:before="100" w:beforeAutospacing="1" w:after="100" w:afterAutospacing="1" w:line="240" w:lineRule="auto"/>
+        <w:spacing w:before="0" w:after="200" w:line="276" w:lineRule="auto"/>
         <w:rPr>
           <w:rFonts w:ascii="Times New Roman" w:eastAsia="Times New Roman" w:hAnsi="Times New Roman" w:cs="Times New Roman"/>
           <w:sz w:val="24"/>
@@ -1466,7 +1469,7 @@
     </w:p>
     <w:p>
       <w:pPr>
-        <w:spacing w:before="100" w:beforeAutospacing="1" w:after="100" w:afterAutospacing="1" w:line="240" w:lineRule="auto"/>
+        <w:spacing w:before="0" w:after="200" w:line="276" w:lineRule="auto"/>
         <w:rPr>
           <w:rFonts w:ascii="Times New Roman" w:eastAsia="Times New Roman" w:hAnsi="Times New Roman" w:cs="Times New Roman"/>
           <w:sz w:val="24"/>
@@ -1511,7 +1514,7 @@
     </w:p>
     <w:p>
       <w:pPr>
-        <w:spacing w:before="100" w:beforeAutospacing="1" w:after="100" w:afterAutospacing="1" w:line="240" w:lineRule="auto"/>
+        <w:spacing w:before="0" w:after="200" w:line="276" w:lineRule="auto"/>
         <w:rPr>
           <w:rFonts w:ascii="Times New Roman" w:eastAsia="Times New Roman" w:hAnsi="Times New Roman" w:cs="Times New Roman"/>
           <w:sz w:val="24"/>
@@ -1565,7 +1568,7 @@
     </w:p>
     <w:p>
       <w:pPr>
-        <w:spacing w:before="100" w:beforeAutospacing="1" w:after="100" w:afterAutospacing="1" w:line="240" w:lineRule="auto"/>
+        <w:spacing w:before="0" w:after="200" w:line="276" w:lineRule="auto"/>
         <w:outlineLvl w:val="1"/>
         <w:rPr>
           <w:rFonts w:ascii="Times New Roman" w:eastAsia="Times New Roman" w:hAnsi="Times New Roman" w:cs="Times New Roman"/>
@@ -1590,7 +1593,7 @@
     </w:p>
     <w:p>
       <w:pPr>
-        <w:spacing w:before="100" w:beforeAutospacing="1" w:after="100" w:afterAutospacing="1" w:line="240" w:lineRule="auto"/>
+        <w:spacing w:before="0" w:after="200" w:line="276" w:lineRule="auto"/>
         <w:rPr>
           <w:rFonts w:ascii="Times New Roman" w:eastAsia="Times New Roman" w:hAnsi="Times New Roman" w:cs="Times New Roman"/>
           <w:sz w:val="24"/>
@@ -1630,7 +1633,7 @@
     </w:p>
     <w:p>
       <w:pPr>
-        <w:spacing w:before="100" w:beforeAutospacing="1" w:after="100" w:afterAutospacing="1" w:line="240" w:lineRule="auto"/>
+        <w:spacing w:before="0" w:after="200" w:line="276" w:lineRule="auto"/>
         <w:rPr>
           <w:rFonts w:ascii="Times New Roman" w:eastAsia="Times New Roman" w:hAnsi="Times New Roman" w:cs="Times New Roman"/>
           <w:sz w:val="24"/>
@@ -1661,7 +1664,7 @@
     </w:p>
     <w:p>
       <w:pPr>
-        <w:spacing w:before="100" w:beforeAutospacing="1" w:after="100" w:afterAutospacing="1" w:line="240" w:lineRule="auto"/>
+        <w:spacing w:before="0" w:after="200" w:line="276" w:lineRule="auto"/>
         <w:rPr>
           <w:rFonts w:ascii="Times New Roman" w:eastAsia="Times New Roman" w:hAnsi="Times New Roman" w:cs="Times New Roman"/>
           <w:sz w:val="24"/>
@@ -1692,7 +1695,7 @@
     </w:p>
     <w:p>
       <w:pPr>
-        <w:spacing w:before="100" w:beforeAutospacing="1" w:after="100" w:afterAutospacing="1" w:line="240" w:lineRule="auto"/>
+        <w:spacing w:before="0" w:after="200" w:line="276" w:lineRule="auto"/>
         <w:rPr>
           <w:rFonts w:ascii="Times New Roman" w:eastAsia="Times New Roman" w:hAnsi="Times New Roman" w:cs="Times New Roman"/>
           <w:sz w:val="24"/>

</xml_diff>